<commit_message>
✨ feat: Atualizando descrições de experiência profissional para maior clareza e precisão, incluindo ajustes em currículos e formatos de apresentação.
</commit_message>
<xml_diff>
--- a/public/resume/curriculo.docx
+++ b/public/resume/curriculo.docx
@@ -126,7 +126,7 @@
       </w:pPr>
       <w:r>
         <w:rPr/>
-        <w:t xml:space="preserve">Desenvolvedor front-end na Deltatec há mais de 6 anos. Único responsável por web e mobile, em equipe com 2 back-ends. Migração para Nuxt 4, Vue 3 e TypeScript. Automação de processos com Playwright e VBA. </w:t>
+        <w:t xml:space="preserve">Desenvolvedor front-end na Deltatec há mais de 6 anos. Atuo no desenvolvimento web e mobile, em parceria com a equipe de back-end. Migração para Nuxt 4, Vue 3 e TypeScript. Automação de processos com Playwright e VBA. </w:t>
       </w:r>
     </w:p>
     <w:p>
@@ -202,7 +202,7 @@
       </w:pPr>
       <w:r>
         <w:rPr/>
-        <w:t xml:space="preserve">Único dev front-end; interfaces web e mobile do sistema interno. </w:t>
+        <w:t xml:space="preserve">Desenvolvimento de interfaces web e mobile do sistema interno. </w:t>
       </w:r>
     </w:p>
     <w:p>

</xml_diff>